<commit_message>
v9.56: sync canon for Education + SaaS; package build
- Registry: added [227]-[231] (Learner/Reader, Educator analytics, Collaboration,
  SaaS admin, Education covenant); count → 235; Registry.docx regenerated.
- Bible: amendment "Education & Multi-Tenant SaaS (2026-10-02)"; Bible.docx regenerated.
- Audit regenerated: Included 75→100, Missing 120→96 (226 enumerated features);
  Excel + checkbox Word refreshed.
- Sync report regenerated (v9.56, 34/34 live).
- Page versions unified to v9.56; home links Learn/Educator/Collaborate/Admin.
- Repackaged QueryBook-v9.56-2026-10-02.zip (407 files, no secrets).

Co-Authored-By: Claude Opus 4.8 <noreply@anthropic.com>
Claude-Session: https://claude.ai/code/session_019szkZU7hLaBcGBEqVSVWY6
</commit_message>
<xml_diff>
--- a/docs/QueryBook-Bible.docx
+++ b/docs/QueryBook-Bible.docx
@@ -11991,6 +11991,48 @@
       </w:pPr>
       <w:r>
         <w:t xml:space="preserve">Status &amp; counsel. Built: the text parser, StyleProfile catalog + application, silhouette policy, context enrichment, MusicSelector/CueEngine, orchestrator, API, and UI (prototype v9.54, QC 14/14). The Gemini/Veo video render and real audio mixing are gated/external (a plan is produced offline). Counsel note: reconstructing scenes from copyrighted sources, depicting real people/places, and cultural/period depiction raise copyright, right-of-publicity, and sensitivity considerations; the interpretive-rendering covenant, no-caricature stance, source sealing, and the dry-run default are designed to help and require qualified-counsel review. Cross-refs: QueryBook Scene Reconstructor Specification (Word); Registry entries [220]–[226] (2026-10-02); Scene Director (qb_gemini).</w:t>
+      </w:r>
+    </w:p>
+    <w:p>
+      <w:pPr>
+        <w:pStyle w:val="Heading1"/>
+        <w:spacing w:after="90" w:before="220"/>
+      </w:pPr>
+      <w:r>
+        <w:t xml:space="preserve">Amendment — Education &amp; Multi-Tenant SaaS front-ends (2026-10-02)</w:t>
+      </w:r>
+    </w:p>
+    <w:p>
+      <w:pPr>
+        <w:pStyle w:val="Heading2"/>
+        <w:spacing w:after="90" w:before="220"/>
+      </w:pPr>
+      <w:r>
+        <w:t xml:space="preserve">From engine primitives to full learner, educator, collaboration, and tenant front-ends</w:t>
+      </w:r>
+    </w:p>
+    <w:p>
+      <w:pPr>
+        <w:spacing w:after="120"/>
+      </w:pPr>
+      <w:r>
+        <w:t xml:space="preserve">Additive. The prototype now ships the Education subsystem and a multi-tenant SaaS console as working front-ends on top of existing primitives (assessment, ontology, rights, integrity): a Learner/Reader experience (/learn) that builds an adaptive lesson — concepts + quiz — from Fact Units, grades deterministically, and reports mastery, misconceptions, a study guide, and a concept map; an Educator analytics dashboard (/educator) with class/cohort mastery, misconception clusters, engagement, and cohort comparison; a Collaboration workspace (/collab) of shared resources, annotations, and threaded discussion, each record provenance-sealed; and a SaaS Admin console (/admin) with a tenant registry, users &amp; roles, plan→edition mapping, usage metering, and per-tenant entitlements.</w:t>
+      </w:r>
+    </w:p>
+    <w:p>
+      <w:pPr>
+        <w:spacing w:after="120"/>
+      </w:pPr>
+      <w:r>
+        <w:t xml:space="preserve">The covenant for education &amp; tenancy. Lessons quiz only verified Fact Units; grading is deterministic; mastery and misconceptions are computed, not asserted. Collaboration content is attributed user input (sealed in the integrity ledger), never promoted to world-truth. Multi-tenancy is a deterministic registry + namespacing contract that derives entitlements from the edition and nothing more — not a hardened production isolation layer (labelled as such, pending a security pass).</w:t>
+      </w:r>
+    </w:p>
+    <w:p>
+      <w:pPr>
+        <w:spacing w:after="120"/>
+      </w:pPr>
+      <w:r>
+        <w:t xml:space="preserve">Status. Built &amp; tested (prototype v9.56): qb_education (QC 7/7), qb_collab (5/5), qb_saas (8/8), end-to-end lesson→grade→class-analytics over HTTP. Registry coverage rose to Included 100 / 226. Counsel note: storing learner performance, identities, and tenant data raises FERPA/student-privacy, data-residency, and multi-tenant-isolation obligations; the deterministic records, provenance sealing, consent gates, and the labelled (not-yet-hardened) isolation are designed to help and require qualified-counsel and a security review before production. Cross-refs: Registry [227]-[231]; audit workbook; Two-System Architecture &amp; Roadmap (Waves 1 &amp; 3).</w:t>
       </w:r>
     </w:p>
     <w:sectPr>

</xml_diff>